<commit_message>
Pesos de inicio reales: Eze 111.6, Nadia 112.6 (medición 8 may 2026)
</commit_message>
<xml_diff>
--- a/Plan_integral_Eze_Nadia.docx
+++ b/Plan_integral_Eze_Nadia.docx
@@ -379,7 +379,7 @@
               <w:spacing w:after="40"/>
             </w:pPr>
             <w:r>
-              <w:t xml:space="preserve">110 kg</w:t>
+              <w:t xml:space="preserve">111,6 kg</w:t>
             </w:r>
           </w:p>
         </w:tc>
@@ -511,7 +511,7 @@
               <w:spacing w:after="40"/>
             </w:pPr>
             <w:r>
-              <w:t xml:space="preserve">110 kg</w:t>
+              <w:t xml:space="preserve">112,6 kg</w:t>
             </w:r>
           </w:p>
         </w:tc>
@@ -574,33 +574,33 @@
         <w:spacing w:after="60"/>
       </w:pPr>
       <w:r>
-        <w:t xml:space="preserve">Ezequiel: 110 → 90 kg. Plazo realista: 7 a 9 meses, bajando ~0,5–0,7 kg por semana.</w:t>
-      </w:r>
-    </w:p>
-    <w:p>
-      <w:pPr>
-        <w:pStyle w:val="ListParagraph"/>
-        <w:numPr>
-          <w:ilvl w:val="0"/>
-          <w:numId w:val="2"/>
-        </w:numPr>
-        <w:spacing w:after="60"/>
-      </w:pPr>
-      <w:r>
-        <w:t xml:space="preserve">Nadia: 110 → 90 kg. Plazo realista: 9 a 11 meses, bajando ~0,4–0,5 kg por semana (en mujeres baja un poco más lento, es normal).</w:t>
-      </w:r>
-    </w:p>
-    <w:p>
-      <w:pPr>
-        <w:pStyle w:val="ListParagraph"/>
-        <w:numPr>
-          <w:ilvl w:val="0"/>
-          <w:numId w:val="2"/>
-        </w:numPr>
-        <w:spacing w:after="60"/>
-      </w:pPr>
-      <w:r>
-        <w:t xml:space="preserve">Hígado graso de Eze: con bajar 7–10% del peso actual (unos 8–11 kg) ya suele revertirse en gran parte. El primer objetivo intermedio es bajar 10 kg → 100 kg.</w:t>
+        <w:t xml:space="preserve">Ezequiel: 111,6 → 90 kg (-21,6 kg). Plazo realista: 7 a 9 meses, bajando ~0,5–0,7 kg por semana.</w:t>
+      </w:r>
+    </w:p>
+    <w:p>
+      <w:pPr>
+        <w:pStyle w:val="ListParagraph"/>
+        <w:numPr>
+          <w:ilvl w:val="0"/>
+          <w:numId w:val="2"/>
+        </w:numPr>
+        <w:spacing w:after="60"/>
+      </w:pPr>
+      <w:r>
+        <w:t xml:space="preserve">Nadia: 112,6 → 90 kg (-22,6 kg). Plazo realista: 9 a 11 meses, bajando ~0,4–0,5 kg por semana (en mujeres baja un poco más lento, es normal).</w:t>
+      </w:r>
+    </w:p>
+    <w:p>
+      <w:pPr>
+        <w:pStyle w:val="ListParagraph"/>
+        <w:numPr>
+          <w:ilvl w:val="0"/>
+          <w:numId w:val="2"/>
+        </w:numPr>
+        <w:spacing w:after="60"/>
+      </w:pPr>
+      <w:r>
+        <w:t xml:space="preserve">Hígado graso de Eze: con bajar 7–10% del peso actual (unos 8–11 kg) ya suele revertirse en gran parte. El primer objetivo intermedio es bajar 10 kg → ~101 kg.</w:t>
       </w:r>
     </w:p>
     <w:p>
@@ -3513,7 +3513,7 @@
         <w:spacing w:after="120"/>
       </w:pPr>
       <w:r>
-        <w:t xml:space="preserve">Punto clave: para hígado graso, la caminata de 30–45 minutos a paso rápido es de las cosas más efectivas que existen. No hace falta correr. Y mucho menos al inicio con 110 kg, donde correr castiga rodillas. La caminata es la base.</w:t>
+        <w:t xml:space="preserve">Punto clave: para hígado graso, la caminata de 30–45 minutos a paso rápido es de las cosas más efectivas que existen. No hace falta correr. Y mucho menos al inicio con más de 110 kg, donde correr castiga rodillas. La caminata es la base.</w:t>
       </w:r>
     </w:p>
     <w:p>
@@ -5395,7 +5395,7 @@
         <w:spacing w:after="60"/>
       </w:pPr>
       <w:r>
-        <w:t xml:space="preserve">Calzado con buena amortiguación. Es importante con 110 kg y rodillas que ya tuvieron uso.</w:t>
+        <w:t xml:space="preserve">Calzado con buena amortiguación. Es importante con más de 110 kg y rodillas que ya tuvieron uso.</w:t>
       </w:r>
     </w:p>
     <w:p>

</xml_diff>

<commit_message>
Objetivo final Nadia 60 kg + callout sobre papa + reemplazos
</commit_message>
<xml_diff>
--- a/Plan_integral_Eze_Nadia.docx
+++ b/Plan_integral_Eze_Nadia.docx
@@ -587,7 +587,20 @@
         <w:spacing w:after="60"/>
       </w:pPr>
       <w:r>
-        <w:t xml:space="preserve">Nadia: 112,6 → 90 kg (-22,6 kg). Plazo realista: 9 a 11 meses, bajando ~0,4–0,5 kg por semana (en mujeres baja un poco más lento, es normal).</w:t>
+        <w:t xml:space="preserve">Nadia, etapa 1: 112,6 → 90 kg (-22,6 kg). Plazo realista: 9 a 11 meses, bajando ~0,4–0,5 kg por semana.</w:t>
+      </w:r>
+    </w:p>
+    <w:p>
+      <w:pPr>
+        <w:pStyle w:val="ListParagraph"/>
+        <w:numPr>
+          <w:ilvl w:val="0"/>
+          <w:numId w:val="2"/>
+        </w:numPr>
+        <w:spacing w:after="60"/>
+      </w:pPr>
+      <w:r>
+        <w:t xml:space="preserve">Nadia, etapa 2 (largo plazo): 90 → 60 kg. Plazo: 24-30 meses adicionales, ritmo más lento (0,2-0,3 kg/sem). Total desde el inicio del plan hasta 60 kg: ~3-3,5 años. Es un proyecto largo pero alcanzable y saludable.</w:t>
       </w:r>
     </w:p>
     <w:p>
@@ -3275,6 +3288,110 @@
       </w:r>
       <w:r>
         <w:t xml:space="preserve">pizza familiar con muzzarella + cerveza + helado en la misma noche. Eso es 3.000 kcal en una sentada y arruina toda la semana.</w:t>
+      </w:r>
+    </w:p>
+    <w:p>
+      <w:pPr>
+        <w:pStyle w:val="Heading2"/>
+        <w:spacing w:after="120" w:before="240"/>
+      </w:pPr>
+      <w:r>
+        <w:rPr>
+          <w:b/>
+          <w:bCs/>
+          <w:color w:val="1F4E79"/>
+        </w:rPr>
+        <w:t xml:space="preserve">Sobre la papa</w:t>
+      </w:r>
+    </w:p>
+    <w:p>
+      <w:pPr>
+        <w:spacing w:after="120"/>
+      </w:pPr>
+      <w:r>
+        <w:t xml:space="preserve">La papa no es "veneno" — tiene potasio, vitamina C y fibra (con cáscara). Pero su perfil glucémico es alto: eleva la insulina rápido, lo que NO es ideal para bajar peso ni para hígado graso. Para uso diario no es una buena elección.</w:t>
+      </w:r>
+    </w:p>
+    <w:p>
+      <w:pPr>
+        <w:pStyle w:val="ListParagraph"/>
+        <w:numPr>
+          <w:ilvl w:val="0"/>
+          <w:numId w:val="2"/>
+        </w:numPr>
+        <w:spacing w:after="60"/>
+      </w:pPr>
+      <w:r>
+        <w:rPr>
+          <w:b/>
+          <w:bCs/>
+        </w:rPr>
+        <w:t xml:space="preserve">Frecuencia: </w:t>
+      </w:r>
+      <w:r>
+        <w:t xml:space="preserve">máximo 1-2 veces por semana. El asado del domingo y un acompañamiento puntual entran. Diaria, no.</w:t>
+      </w:r>
+    </w:p>
+    <w:p>
+      <w:pPr>
+        <w:pStyle w:val="ListParagraph"/>
+        <w:numPr>
+          <w:ilvl w:val="0"/>
+          <w:numId w:val="2"/>
+        </w:numPr>
+        <w:spacing w:after="60"/>
+      </w:pPr>
+      <w:r>
+        <w:rPr>
+          <w:b/>
+          <w:bCs/>
+          <w:color w:val="548235"/>
+        </w:rPr>
+        <w:t xml:space="preserve">Reemplazos cotidianos: </w:t>
+      </w:r>
+      <w:r>
+        <w:t xml:space="preserve">boniato (mismo formato, mucho mejor perfil), calabaza, coliflor en puré, arroz integral, quinoa, lentejas y garbanzos.</w:t>
+      </w:r>
+    </w:p>
+    <w:p>
+      <w:pPr>
+        <w:pStyle w:val="ListParagraph"/>
+        <w:numPr>
+          <w:ilvl w:val="0"/>
+          <w:numId w:val="2"/>
+        </w:numPr>
+        <w:spacing w:after="60"/>
+      </w:pPr>
+      <w:r>
+        <w:rPr>
+          <w:b/>
+          <w:bCs/>
+        </w:rPr>
+        <w:t xml:space="preserve">Cuando sí coman papa: </w:t>
+      </w:r>
+      <w:r>
+        <w:t xml:space="preserve">hervida o al horno (nunca frita), con cáscara cuando se pueda (más fibra), porción del tamaño de un puño, acompañada de proteína y verdura para amortiguar el pico de azúcar.</w:t>
+      </w:r>
+    </w:p>
+    <w:p>
+      <w:pPr>
+        <w:pStyle w:val="ListParagraph"/>
+        <w:numPr>
+          <w:ilvl w:val="0"/>
+          <w:numId w:val="2"/>
+        </w:numPr>
+        <w:spacing w:after="60"/>
+      </w:pPr>
+      <w:r>
+        <w:rPr>
+          <w:b/>
+          <w:bCs/>
+          <w:color w:val="C00000"/>
+        </w:rPr>
+        <w:t xml:space="preserve">Lo peor de la papa: </w:t>
+      </w:r>
+      <w:r>
+        <w:t xml:space="preserve">frita (papas fritas, bastones), purés con manteca y crema, papa con queso. Eso convierte un alimento decente en un ataque calórico.</w:t>
       </w:r>
     </w:p>
     <w:p>

</xml_diff>